<commit_message>
docs: refine interview workbook layout
</commit_message>
<xml_diff>
--- a/数字IC校招项目面试模拟与参考回答.docx
+++ b/数字IC校招项目面试模拟与参考回答.docx
@@ -491,7 +491,6 @@
       <w:pPr>
         <w:pStyle w:val="Heading1"/>
         <w:keepNext/>
-        <w:pageBreakBefore/>
       </w:pPr>
       <w:r>
         <w:t>第一轮 项目全局与个人工作</w:t>
@@ -1260,7 +1259,6 @@
       <w:pPr>
         <w:pStyle w:val="Heading1"/>
         <w:keepNext/>
-        <w:pageBreakBefore/>
       </w:pPr>
       <w:r>
         <w:t>第二轮 总线外设与存储系统</w:t>
@@ -2788,7 +2786,6 @@
       <w:pPr>
         <w:pStyle w:val="Heading1"/>
         <w:keepNext/>
-        <w:pageBreakBefore/>
       </w:pPr>
       <w:r>
         <w:t>第三轮 CPU CSR Trap 与中断</w:t>
@@ -4063,7 +4060,6 @@
       <w:pPr>
         <w:pStyle w:val="Heading1"/>
         <w:keepNext/>
-        <w:pageBreakBefore/>
       </w:pPr>
       <w:r>
         <w:t>第四轮 DMA 仲裁与数据搬运</w:t>
@@ -4579,7 +4575,6 @@
       <w:pPr>
         <w:pStyle w:val="Heading1"/>
         <w:keepNext/>
-        <w:pageBreakBefore/>
       </w:pPr>
       <w:r>
         <w:t>第五轮 CDC 与异步 FIFO</w:t>
@@ -5555,7 +5550,6 @@
       <w:pPr>
         <w:pStyle w:val="Heading1"/>
         <w:keepNext/>
-        <w:pageBreakBefore/>
       </w:pPr>
       <w:r>
         <w:t>第六轮 FIR 定点音频与 I2S</w:t>
@@ -6462,7 +6456,6 @@
       <w:pPr>
         <w:pStyle w:val="Heading1"/>
         <w:keepNext/>
-        <w:pageBreakBefore/>
       </w:pPr>
       <w:r>
         <w:t>第七轮 验证调试与项目复盘</w:t>
@@ -6978,7 +6971,6 @@
       <w:pPr>
         <w:pStyle w:val="Heading1"/>
         <w:keepNext/>
-        <w:pageBreakBefore/>
       </w:pPr>
       <w:r>
         <w:t>面试收尾准备</w:t>
@@ -8068,9 +8060,6 @@
     <w:qFormat/>
     <w:rsid w:val="00FC693F"/>
     <w:pPr>
-      <w:pBdr>
-        <w:bottom w:val="single" w:sz="8" w:space="4" w:color="4F81BD" w:themeColor="accent1"/>
-      </w:pBdr>
       <w:spacing w:after="180" w:line="240" w:lineRule="auto"/>
       <w:contextualSpacing/>
     </w:pPr>

</xml_diff>